<commit_message>
update: Präsentation v2 — Daten-Folie mit Q2-Kennzahlen — DungeonMasterAlex
</commit_message>
<xml_diff>
--- a/belle-immo-ag/strategies/belle-immo-praesentation-storyboard-2026.docx
+++ b/belle-immo-ag/strategies/belle-immo-praesentation-storyboard-2026.docx
@@ -86,7 +86,7 @@
                 <w:color w:val="666666"/>
                 <w:sz w:val="18"/>
               </w:rPr>
-              <w:t>30 Min. Präsentation  ·  15–30 Min. Diskussion  ·  11 Folien</w:t>
+              <w:t>30 Min. Präsentation  ·  15–30 Min. Diskussion  ·  12 Folien</w:t>
             </w:r>
           </w:p>
         </w:tc>
@@ -119,7 +119,7 @@
           <w:color w:val="666666"/>
           <w:sz w:val="19"/>
         </w:rPr>
-        <w:t>Dieses Dokument ist das Storyboard — es zeigt Inhalt und Kernbotschaft jeder Folie. Die Details stehen im Strategiepapier. Die Präsentation soll inspirieren und die gemeinsame Richtung bestätigen, nicht alle Massnahmen erklären.</w:t>
+        <w:t>Dieses Dokument ist das Storyboard — Inhalt und Kernbotschaft jeder Folie. Die Details stehen im Strategiepapier. Die Präsentation soll inspirieren, nicht alle Massnahmen erklären.</w:t>
       </w:r>
     </w:p>
     <w:p>
@@ -334,7 +334,7 @@
           <w:color w:val="666666"/>
           <w:sz w:val="18"/>
         </w:rPr>
-        <w:t>Vollbild, dunkler Hintergrund, grosse Schrift. Keine Bulletpoints. Nur die Vision. Der Kunde weiss nach 10 Sekunden, wohin die Reise geht.</w:t>
+        <w:t>Vollbild, dunkler Hintergrund, grosse Schrift. Keine Bulletpoints. Nur die Vision.</w:t>
       </w:r>
     </w:p>
     <w:p>
@@ -387,7 +387,7 @@
                 <w:i/>
                 <w:sz w:val="19"/>
               </w:rPr>
-              <w:t>Der Kunde soll bereits nach der ersten Minute wissen, wohin die Reise geht — nicht wo wir heute stehen.</w:t>
+              <w:t>Der Kunde weiss nach 10 Sekunden, wohin die Reise geht — nicht wo wir heute stehen.</w:t>
             </w:r>
           </w:p>
         </w:tc>
@@ -511,7 +511,883 @@
                 <w:color w:val="FFFFFF"/>
                 <w:sz w:val="28"/>
               </w:rPr>
-              <w:t>Warum verändern wir etwas?</w:t>
+              <w:t>Die Zahlen — was uns zur Wende bewogen hat</w:t>
+            </w:r>
+          </w:p>
+        </w:tc>
+      </w:tr>
+    </w:tbl>
+    <w:p>
+      <w:pPr>
+        <w:spacing w:before="0" w:after="40"/>
+      </w:pPr>
+    </w:p>
+    <w:p>
+      <w:pPr>
+        <w:spacing w:before="40" w:after="200"/>
+      </w:pPr>
+      <w:r>
+        <w:rPr>
+          <w:rFonts w:ascii="Calibri" w:hAnsi="Calibri"/>
+          <w:b/>
+          <w:i w:val="0"/>
+          <w:color w:val="033D62"/>
+          <w:sz w:val="22"/>
+        </w:rPr>
+        <w:t>Q2 2026 — 90 Tage LinkedIn. Hier sind die Zahlen, hinter denen wir nicht mehr stehen.</w:t>
+      </w:r>
+    </w:p>
+    <w:tbl>
+      <w:tblPr>
+        <w:tblStyle w:val="TableGrid"/>
+        <w:tblW w:type="auto" w:w="0"/>
+        <w:tblLook w:firstColumn="1" w:firstRow="1" w:lastColumn="0" w:lastRow="0" w:noHBand="0" w:noVBand="1" w:val="04A0"/>
+      </w:tblPr>
+      <w:tblGrid>
+        <w:gridCol w:w="3231"/>
+        <w:gridCol w:w="3231"/>
+        <w:gridCol w:w="3231"/>
+      </w:tblGrid>
+      <w:tr>
+        <w:tc>
+          <w:tcPr>
+            <w:tcW w:type="dxa" w:w="3135"/>
+            <w:tcBorders>
+              <w:top w:val="none"/>
+              <w:left w:val="none"/>
+              <w:bottom w:val="none"/>
+              <w:right w:val="none"/>
+            </w:tcBorders>
+            <w:shd w:val="clear" w:color="auto" w:fill="FFF0F0"/>
+            <w:tcBorders>
+              <w:top w:val="single" w:sz="6" w:color="CC2222"/>
+              <w:left w:val="single" w:sz="4" w:color="DDDDDD"/>
+              <w:bottom w:val="single" w:sz="4" w:color="DDDDDD"/>
+              <w:right w:val="single" w:sz="4" w:color="DDDDDD"/>
+            </w:tcBorders>
+          </w:tcPr>
+          <w:p>
+            <w:pPr>
+              <w:spacing w:before="200" w:after="40"/>
+              <w:jc w:val="center"/>
+            </w:pPr>
+            <w:r>
+              <w:rPr>
+                <w:rFonts w:ascii="Calibri" w:hAnsi="Calibri"/>
+                <w:b/>
+                <w:i w:val="0"/>
+                <w:color w:val="CC2222"/>
+                <w:sz w:val="52"/>
+              </w:rPr>
+              <w:t>+7</w:t>
+            </w:r>
+          </w:p>
+          <w:p>
+            <w:pPr>
+              <w:spacing w:before="0" w:after="80"/>
+              <w:jc w:val="center"/>
+            </w:pPr>
+            <w:r>
+              <w:rPr>
+                <w:rFonts w:ascii="Calibri" w:hAnsi="Calibri"/>
+                <w:b/>
+                <w:i w:val="0"/>
+                <w:color w:val="222222"/>
+                <w:sz w:val="18"/>
+              </w:rPr>
+              <w:t>neue Follower</w:t>
+              <w:br/>
+              <w:t>in 90 Tagen</w:t>
+            </w:r>
+          </w:p>
+          <w:p>
+            <w:pPr>
+              <w:spacing w:before="80" w:after="160"/>
+            </w:pPr>
+            <w:r>
+              <w:rPr>
+                <w:rFonts w:ascii="Calibri" w:hAnsi="Calibri"/>
+                <w:b w:val="0"/>
+                <w:i/>
+                <w:color w:val="666666"/>
+                <w:sz w:val="17"/>
+              </w:rPr>
+              <w:t>394 Follower total. Bei diesem Tempo: über ein Jahr für 100 neue.</w:t>
+            </w:r>
+          </w:p>
+        </w:tc>
+        <w:tc>
+          <w:tcPr>
+            <w:tcW w:type="dxa" w:w="3135"/>
+            <w:tcBorders>
+              <w:top w:val="none"/>
+              <w:left w:val="none"/>
+              <w:bottom w:val="none"/>
+              <w:right w:val="none"/>
+            </w:tcBorders>
+            <w:shd w:val="clear" w:color="auto" w:fill="FFF0F0"/>
+            <w:tcBorders>
+              <w:top w:val="single" w:sz="6" w:color="CC2222"/>
+              <w:left w:val="single" w:sz="4" w:color="DDDDDD"/>
+              <w:bottom w:val="single" w:sz="4" w:color="DDDDDD"/>
+              <w:right w:val="single" w:sz="4" w:color="DDDDDD"/>
+            </w:tcBorders>
+          </w:tcPr>
+          <w:p>
+            <w:pPr>
+              <w:spacing w:before="200" w:after="40"/>
+              <w:jc w:val="center"/>
+            </w:pPr>
+            <w:r>
+              <w:rPr>
+                <w:rFonts w:ascii="Calibri" w:hAnsi="Calibri"/>
+                <w:b/>
+                <w:i w:val="0"/>
+                <w:color w:val="CC2222"/>
+                <w:sz w:val="52"/>
+              </w:rPr>
+              <w:t>6</w:t>
+            </w:r>
+          </w:p>
+          <w:p>
+            <w:pPr>
+              <w:spacing w:before="0" w:after="80"/>
+              <w:jc w:val="center"/>
+            </w:pPr>
+            <w:r>
+              <w:rPr>
+                <w:rFonts w:ascii="Calibri" w:hAnsi="Calibri"/>
+                <w:b/>
+                <w:i w:val="0"/>
+                <w:color w:val="222222"/>
+                <w:sz w:val="18"/>
+              </w:rPr>
+              <w:t>Kommentare</w:t>
+              <w:br/>
+              <w:t>auf 16 Posts</w:t>
+            </w:r>
+          </w:p>
+          <w:p>
+            <w:pPr>
+              <w:spacing w:before="80" w:after="160"/>
+            </w:pPr>
+            <w:r>
+              <w:rPr>
+                <w:rFonts w:ascii="Calibri" w:hAnsi="Calibri"/>
+                <w:b w:val="0"/>
+                <w:i/>
+                <w:color w:val="666666"/>
+                <w:sz w:val="17"/>
+              </w:rPr>
+              <w:t>0,4 pro Beitrag. Kein einziges echtes Gespräch in 90 Tagen.</w:t>
+            </w:r>
+          </w:p>
+        </w:tc>
+        <w:tc>
+          <w:tcPr>
+            <w:tcW w:type="dxa" w:w="3135"/>
+            <w:tcBorders>
+              <w:top w:val="none"/>
+              <w:left w:val="none"/>
+              <w:bottom w:val="none"/>
+              <w:right w:val="none"/>
+            </w:tcBorders>
+            <w:shd w:val="clear" w:color="auto" w:fill="FFF0F0"/>
+            <w:tcBorders>
+              <w:top w:val="single" w:sz="6" w:color="CC2222"/>
+              <w:left w:val="single" w:sz="4" w:color="DDDDDD"/>
+              <w:bottom w:val="single" w:sz="4" w:color="DDDDDD"/>
+              <w:right w:val="single" w:sz="4" w:color="DDDDDD"/>
+            </w:tcBorders>
+          </w:tcPr>
+          <w:p>
+            <w:pPr>
+              <w:spacing w:before="200" w:after="40"/>
+              <w:jc w:val="center"/>
+            </w:pPr>
+            <w:r>
+              <w:rPr>
+                <w:rFonts w:ascii="Calibri" w:hAnsi="Calibri"/>
+                <w:b/>
+                <w:i w:val="0"/>
+                <w:color w:val="CC2222"/>
+                <w:sz w:val="52"/>
+              </w:rPr>
+              <w:t>0</w:t>
+            </w:r>
+          </w:p>
+          <w:p>
+            <w:pPr>
+              <w:spacing w:before="0" w:after="80"/>
+              <w:jc w:val="center"/>
+            </w:pPr>
+            <w:r>
+              <w:rPr>
+                <w:rFonts w:ascii="Calibri" w:hAnsi="Calibri"/>
+                <w:b/>
+                <w:i w:val="0"/>
+                <w:color w:val="222222"/>
+                <w:sz w:val="18"/>
+              </w:rPr>
+              <w:t>Posts zum</w:t>
+              <w:br/>
+              <w:t>Thema Land</w:t>
+            </w:r>
+          </w:p>
+          <w:p>
+            <w:pPr>
+              <w:spacing w:before="80" w:after="160"/>
+            </w:pPr>
+            <w:r>
+              <w:rPr>
+                <w:rFonts w:ascii="Calibri" w:hAnsi="Calibri"/>
+                <w:b w:val="0"/>
+                <w:i/>
+                <w:color w:val="666666"/>
+                <w:sz w:val="17"/>
+              </w:rPr>
+              <w:t>Landakquise ist ein definiertes Ziel — auf LinkedIn vollständig inexistent.</w:t>
+            </w:r>
+          </w:p>
+        </w:tc>
+      </w:tr>
+      <w:tr>
+        <w:tc>
+          <w:tcPr>
+            <w:tcW w:type="dxa" w:w="3135"/>
+            <w:tcBorders>
+              <w:top w:val="none"/>
+              <w:left w:val="none"/>
+              <w:bottom w:val="none"/>
+              <w:right w:val="none"/>
+            </w:tcBorders>
+            <w:shd w:val="clear" w:color="auto" w:fill="FFF8E6"/>
+            <w:tcBorders>
+              <w:top w:val="single" w:sz="6" w:color="C06000"/>
+              <w:left w:val="single" w:sz="4" w:color="DDDDDD"/>
+              <w:bottom w:val="single" w:sz="4" w:color="DDDDDD"/>
+              <w:right w:val="single" w:sz="4" w:color="DDDDDD"/>
+            </w:tcBorders>
+          </w:tcPr>
+          <w:p>
+            <w:pPr>
+              <w:spacing w:before="200" w:after="40"/>
+              <w:jc w:val="center"/>
+            </w:pPr>
+            <w:r>
+              <w:rPr>
+                <w:rFonts w:ascii="Calibri" w:hAnsi="Calibri"/>
+                <w:b/>
+                <w:i w:val="0"/>
+                <w:color w:val="C06000"/>
+                <w:sz w:val="52"/>
+              </w:rPr>
+              <w:t>69 %</w:t>
+            </w:r>
+          </w:p>
+          <w:p>
+            <w:pPr>
+              <w:spacing w:before="0" w:after="80"/>
+              <w:jc w:val="center"/>
+            </w:pPr>
+            <w:r>
+              <w:rPr>
+                <w:rFonts w:ascii="Calibri" w:hAnsi="Calibri"/>
+                <w:b/>
+                <w:i w:val="0"/>
+                <w:color w:val="222222"/>
+                <w:sz w:val="18"/>
+              </w:rPr>
+              <w:t>der Posts zahlen</w:t>
+              <w:br/>
+              <w:t>nur auf Vertrauen ein</w:t>
+            </w:r>
+          </w:p>
+          <w:p>
+            <w:pPr>
+              <w:spacing w:before="80" w:after="160"/>
+            </w:pPr>
+            <w:r>
+              <w:rPr>
+                <w:rFonts w:ascii="Calibri" w:hAnsi="Calibri"/>
+                <w:b w:val="0"/>
+                <w:i/>
+                <w:color w:val="666666"/>
+                <w:sz w:val="17"/>
+              </w:rPr>
+              <w:t>Investoren: 6 %. Land: 0 %. Drei von vier Zielen werden ignoriert.</w:t>
+            </w:r>
+          </w:p>
+        </w:tc>
+        <w:tc>
+          <w:tcPr>
+            <w:tcW w:type="dxa" w:w="3135"/>
+            <w:tcBorders>
+              <w:top w:val="none"/>
+              <w:left w:val="none"/>
+              <w:bottom w:val="none"/>
+              <w:right w:val="none"/>
+            </w:tcBorders>
+            <w:shd w:val="clear" w:color="auto" w:fill="FFF8E6"/>
+            <w:tcBorders>
+              <w:top w:val="single" w:sz="6" w:color="C06000"/>
+              <w:left w:val="single" w:sz="4" w:color="DDDDDD"/>
+              <w:bottom w:val="single" w:sz="4" w:color="DDDDDD"/>
+              <w:right w:val="single" w:sz="4" w:color="DDDDDD"/>
+            </w:tcBorders>
+          </w:tcPr>
+          <w:p>
+            <w:pPr>
+              <w:spacing w:before="200" w:after="40"/>
+              <w:jc w:val="center"/>
+            </w:pPr>
+            <w:r>
+              <w:rPr>
+                <w:rFonts w:ascii="Calibri" w:hAnsi="Calibri"/>
+                <w:b/>
+                <w:i w:val="0"/>
+                <w:color w:val="C06000"/>
+                <w:sz w:val="52"/>
+              </w:rPr>
+              <w:t>0,35 %</w:t>
+            </w:r>
+          </w:p>
+          <w:p>
+            <w:pPr>
+              <w:spacing w:before="0" w:after="80"/>
+              <w:jc w:val="center"/>
+            </w:pPr>
+            <w:r>
+              <w:rPr>
+                <w:rFonts w:ascii="Calibri" w:hAnsi="Calibri"/>
+                <w:b/>
+                <w:i w:val="0"/>
+                <w:color w:val="222222"/>
+                <w:sz w:val="18"/>
+              </w:rPr>
+              <w:t>CTR</w:t>
+              <w:br/>
+              <w:t>bezahlte Kampagne</w:t>
+            </w:r>
+          </w:p>
+          <w:p>
+            <w:pPr>
+              <w:spacing w:before="80" w:after="160"/>
+            </w:pPr>
+            <w:r>
+              <w:rPr>
+                <w:rFonts w:ascii="Calibri" w:hAnsi="Calibri"/>
+                <w:b w:val="0"/>
+                <w:i/>
+                <w:color w:val="666666"/>
+                <w:sz w:val="17"/>
+              </w:rPr>
+              <w:t>9'766 gesponserte Impressions → 34 Klicks. Das Geld arbeitet nicht.</w:t>
+            </w:r>
+          </w:p>
+        </w:tc>
+        <w:tc>
+          <w:tcPr>
+            <w:tcW w:type="dxa" w:w="3135"/>
+            <w:tcBorders>
+              <w:top w:val="none"/>
+              <w:left w:val="none"/>
+              <w:bottom w:val="none"/>
+              <w:right w:val="none"/>
+            </w:tcBorders>
+            <w:shd w:val="clear" w:color="auto" w:fill="FFF8E6"/>
+            <w:tcBorders>
+              <w:top w:val="single" w:sz="6" w:color="C06000"/>
+              <w:left w:val="single" w:sz="4" w:color="DDDDDD"/>
+              <w:bottom w:val="single" w:sz="4" w:color="DDDDDD"/>
+              <w:right w:val="single" w:sz="4" w:color="DDDDDD"/>
+            </w:tcBorders>
+          </w:tcPr>
+          <w:p>
+            <w:pPr>
+              <w:spacing w:before="200" w:after="40"/>
+              <w:jc w:val="center"/>
+            </w:pPr>
+            <w:r>
+              <w:rPr>
+                <w:rFonts w:ascii="Calibri" w:hAnsi="Calibri"/>
+                <w:b/>
+                <w:i w:val="0"/>
+                <w:color w:val="C06000"/>
+                <w:sz w:val="52"/>
+              </w:rPr>
+              <w:t>25</w:t>
+            </w:r>
+          </w:p>
+          <w:p>
+            <w:pPr>
+              <w:spacing w:before="0" w:after="80"/>
+              <w:jc w:val="center"/>
+            </w:pPr>
+            <w:r>
+              <w:rPr>
+                <w:rFonts w:ascii="Calibri" w:hAnsi="Calibri"/>
+                <w:b/>
+                <w:i w:val="0"/>
+                <w:color w:val="222222"/>
+                <w:sz w:val="18"/>
+              </w:rPr>
+              <w:t>individuelle</w:t>
+              <w:br/>
+              <w:t>Profilbesucher</w:t>
+            </w:r>
+          </w:p>
+          <w:p>
+            <w:pPr>
+              <w:spacing w:before="80" w:after="160"/>
+            </w:pPr>
+            <w:r>
+              <w:rPr>
+                <w:rFonts w:ascii="Calibri" w:hAnsi="Calibri"/>
+                <w:b w:val="0"/>
+                <w:i/>
+                <w:color w:val="666666"/>
+                <w:sz w:val="17"/>
+              </w:rPr>
+              <w:t>62 Seitenaufrufe in 90 Tagen. Belle Immo wird kaum aktiv gesucht.</w:t>
+            </w:r>
+          </w:p>
+        </w:tc>
+      </w:tr>
+    </w:tbl>
+    <w:p>
+      <w:pPr>
+        <w:spacing w:before="0" w:after="160"/>
+      </w:pPr>
+    </w:p>
+    <w:p>
+      <w:pPr>
+        <w:spacing w:before="80" w:after="80"/>
+      </w:pPr>
+      <w:r>
+        <w:rPr>
+          <w:rFonts w:ascii="Calibri" w:hAnsi="Calibri"/>
+          <w:b/>
+          <w:i w:val="0"/>
+          <w:color w:val="1A7A4A"/>
+          <w:sz w:val="21"/>
+        </w:rPr>
+        <w:t>Und doch: der Content selbst ist gut.</w:t>
+      </w:r>
+    </w:p>
+    <w:tbl>
+      <w:tblPr>
+        <w:tblStyle w:val="TableGrid"/>
+        <w:tblW w:type="auto" w:w="0"/>
+        <w:tblLook w:firstColumn="1" w:firstRow="1" w:lastColumn="0" w:lastRow="0" w:noHBand="0" w:noVBand="1" w:val="04A0"/>
+      </w:tblPr>
+      <w:tblGrid>
+        <w:gridCol w:w="3231"/>
+        <w:gridCol w:w="3231"/>
+        <w:gridCol w:w="3231"/>
+      </w:tblGrid>
+      <w:tr>
+        <w:tc>
+          <w:tcPr>
+            <w:tcW w:type="dxa" w:w="3135"/>
+            <w:tcBorders>
+              <w:top w:val="none"/>
+              <w:left w:val="none"/>
+              <w:bottom w:val="none"/>
+              <w:right w:val="none"/>
+            </w:tcBorders>
+            <w:shd w:val="clear" w:color="auto" w:fill="E8F4E8"/>
+            <w:tcBorders>
+              <w:top w:val="single" w:sz="6" w:color="1A7A4A"/>
+              <w:left w:val="single" w:sz="4" w:color="DDDDDD"/>
+              <w:bottom w:val="single" w:sz="4" w:color="DDDDDD"/>
+              <w:right w:val="single" w:sz="4" w:color="DDDDDD"/>
+            </w:tcBorders>
+          </w:tcPr>
+          <w:p>
+            <w:pPr>
+              <w:spacing w:before="160" w:after="40"/>
+              <w:jc w:val="center"/>
+            </w:pPr>
+            <w:r>
+              <w:rPr>
+                <w:rFonts w:ascii="Calibri" w:hAnsi="Calibri"/>
+                <w:b/>
+                <w:i w:val="0"/>
+                <w:color w:val="1A7A4A"/>
+                <w:sz w:val="44"/>
+              </w:rPr>
+              <w:t>ER 31–45 %</w:t>
+            </w:r>
+          </w:p>
+          <w:p>
+            <w:pPr>
+              <w:spacing w:before="0" w:after="80"/>
+              <w:jc w:val="center"/>
+            </w:pPr>
+            <w:r>
+              <w:rPr>
+                <w:rFonts w:ascii="Calibri" w:hAnsi="Calibri"/>
+                <w:b/>
+                <w:i w:val="0"/>
+                <w:color w:val="222222"/>
+                <w:sz w:val="18"/>
+              </w:rPr>
+              <w:t>bei den Top-Posts</w:t>
+            </w:r>
+          </w:p>
+          <w:p>
+            <w:pPr>
+              <w:spacing w:before="80" w:after="160"/>
+            </w:pPr>
+            <w:r>
+              <w:rPr>
+                <w:rFonts w:ascii="Calibri" w:hAnsi="Calibri"/>
+                <w:b w:val="0"/>
+                <w:i/>
+                <w:color w:val="666666"/>
+                <w:sz w:val="17"/>
+              </w:rPr>
+              <w:t>Wer den Content sieht, reagiert stark darauf.</w:t>
+            </w:r>
+          </w:p>
+        </w:tc>
+        <w:tc>
+          <w:tcPr>
+            <w:tcW w:type="dxa" w:w="3135"/>
+            <w:tcBorders>
+              <w:top w:val="none"/>
+              <w:left w:val="none"/>
+              <w:bottom w:val="none"/>
+              <w:right w:val="none"/>
+            </w:tcBorders>
+            <w:shd w:val="clear" w:color="auto" w:fill="E8F4E8"/>
+            <w:tcBorders>
+              <w:top w:val="single" w:sz="6" w:color="1A7A4A"/>
+              <w:left w:val="single" w:sz="4" w:color="DDDDDD"/>
+              <w:bottom w:val="single" w:sz="4" w:color="DDDDDD"/>
+              <w:right w:val="single" w:sz="4" w:color="DDDDDD"/>
+            </w:tcBorders>
+          </w:tcPr>
+          <w:p>
+            <w:pPr>
+              <w:spacing w:before="160" w:after="40"/>
+              <w:jc w:val="center"/>
+            </w:pPr>
+            <w:r>
+              <w:rPr>
+                <w:rFonts w:ascii="Calibri" w:hAnsi="Calibri"/>
+                <w:b/>
+                <w:i w:val="0"/>
+                <w:color w:val="1A7A4A"/>
+                <w:sz w:val="44"/>
+              </w:rPr>
+              <w:t>9,2 %</w:t>
+            </w:r>
+          </w:p>
+          <w:p>
+            <w:pPr>
+              <w:spacing w:before="0" w:after="80"/>
+              <w:jc w:val="center"/>
+            </w:pPr>
+            <w:r>
+              <w:rPr>
+                <w:rFonts w:ascii="Calibri" w:hAnsi="Calibri"/>
+                <w:b/>
+                <w:i w:val="0"/>
+                <w:color w:val="222222"/>
+                <w:sz w:val="18"/>
+              </w:rPr>
+              <w:t>organische CTR</w:t>
+            </w:r>
+          </w:p>
+          <w:p>
+            <w:pPr>
+              <w:spacing w:before="80" w:after="160"/>
+            </w:pPr>
+            <w:r>
+              <w:rPr>
+                <w:rFonts w:ascii="Calibri" w:hAnsi="Calibri"/>
+                <w:b w:val="0"/>
+                <w:i/>
+                <w:color w:val="666666"/>
+                <w:sz w:val="17"/>
+              </w:rPr>
+              <w:t>686 Klicks auf 7'462 Impressions. Wer sieht, klickt.</w:t>
+            </w:r>
+          </w:p>
+        </w:tc>
+        <w:tc>
+          <w:tcPr>
+            <w:tcW w:type="dxa" w:w="3135"/>
+            <w:tcBorders>
+              <w:top w:val="none"/>
+              <w:left w:val="none"/>
+              <w:bottom w:val="none"/>
+              <w:right w:val="none"/>
+            </w:tcBorders>
+            <w:shd w:val="clear" w:color="auto" w:fill="EBF4FA"/>
+            <w:tcBorders>
+              <w:top w:val="single" w:sz="6" w:color="055a8d"/>
+              <w:left w:val="single" w:sz="4" w:color="DDDDDD"/>
+              <w:bottom w:val="single" w:sz="4" w:color="DDDDDD"/>
+              <w:right w:val="single" w:sz="4" w:color="DDDDDD"/>
+            </w:tcBorders>
+          </w:tcPr>
+          <w:p>
+            <w:pPr>
+              <w:spacing w:before="160" w:after="40"/>
+              <w:jc w:val="center"/>
+            </w:pPr>
+            <w:r>
+              <w:rPr>
+                <w:rFonts w:ascii="Calibri" w:hAnsi="Calibri"/>
+                <w:b/>
+                <w:i w:val="0"/>
+                <w:color w:val="055A8D"/>
+                <w:sz w:val="44"/>
+              </w:rPr>
+              <w:t>1</w:t>
+            </w:r>
+          </w:p>
+          <w:p>
+            <w:pPr>
+              <w:spacing w:before="0" w:after="80"/>
+              <w:jc w:val="center"/>
+            </w:pPr>
+            <w:r>
+              <w:rPr>
+                <w:rFonts w:ascii="Calibri" w:hAnsi="Calibri"/>
+                <w:b/>
+                <w:i w:val="0"/>
+                <w:color w:val="222222"/>
+                <w:sz w:val="18"/>
+              </w:rPr>
+              <w:t>Investor-Conversion</w:t>
+            </w:r>
+          </w:p>
+          <w:p>
+            <w:pPr>
+              <w:spacing w:before="80" w:after="160"/>
+            </w:pPr>
+            <w:r>
+              <w:rPr>
+                <w:rFonts w:ascii="Calibri" w:hAnsi="Calibri"/>
+                <w:b w:val="0"/>
+                <w:i/>
+                <w:color w:val="666666"/>
+                <w:sz w:val="17"/>
+              </w:rPr>
+              <w:t>Die laufende Kampagne hat bereits gewirkt.</w:t>
+            </w:r>
+          </w:p>
+        </w:tc>
+      </w:tr>
+    </w:tbl>
+    <w:p>
+      <w:pPr>
+        <w:spacing w:before="0" w:after="120"/>
+      </w:pPr>
+    </w:p>
+    <w:p>
+      <w:pPr>
+        <w:spacing w:before="40" w:after="0"/>
+      </w:pPr>
+      <w:r>
+        <w:rPr>
+          <w:rFonts w:ascii="Calibri" w:hAnsi="Calibri"/>
+          <w:b/>
+          <w:i w:val="0"/>
+          <w:color w:val="055A8D"/>
+          <w:sz w:val="21"/>
+        </w:rPr>
+        <w:t xml:space="preserve">Fazit: </w:t>
+      </w:r>
+      <w:r>
+        <w:rPr>
+          <w:rFonts w:ascii="Calibri" w:hAnsi="Calibri"/>
+          <w:b w:val="0"/>
+          <w:i/>
+          <w:sz w:val="21"/>
+        </w:rPr>
+        <w:t>Das Problem ist nicht der Content. Das Problem ist das System.</w:t>
+      </w:r>
+    </w:p>
+    <w:p>
+      <w:pPr>
+        <w:spacing w:before="0" w:after="60"/>
+      </w:pPr>
+    </w:p>
+    <w:tbl>
+      <w:tblPr>
+        <w:tblStyle w:val="TableGrid"/>
+        <w:tblW w:type="auto" w:w="0"/>
+        <w:tblLook w:firstColumn="1" w:firstRow="1" w:lastColumn="0" w:lastRow="0" w:noHBand="0" w:noVBand="1" w:val="04A0"/>
+      </w:tblPr>
+      <w:tblGrid>
+        <w:gridCol w:w="9406"/>
+      </w:tblGrid>
+      <w:tr>
+        <w:tc>
+          <w:tcPr>
+            <w:tcW w:type="dxa" w:w="9406"/>
+            <w:tcBorders>
+              <w:top w:val="none"/>
+              <w:left w:val="none"/>
+              <w:bottom w:val="none"/>
+              <w:right w:val="none"/>
+            </w:tcBorders>
+            <w:shd w:val="clear" w:color="auto" w:fill="FFF8E6"/>
+            <w:tcBorders>
+              <w:left w:val="single" w:sz="14" w:color="E8A820"/>
+            </w:tcBorders>
+          </w:tcPr>
+          <w:p>
+            <w:pPr>
+              <w:spacing w:before="80" w:after="80"/>
+            </w:pPr>
+            <w:r>
+              <w:rPr>
+                <w:rFonts w:ascii="Calibri" w:hAnsi="Calibri"/>
+                <w:b/>
+                <w:i w:val="0"/>
+                <w:color w:val="B07A00"/>
+                <w:sz w:val="19"/>
+              </w:rPr>
+              <w:t xml:space="preserve">→ Kernbotschaft:  </w:t>
+            </w:r>
+            <w:r>
+              <w:rPr>
+                <w:rFonts w:ascii="Calibri" w:hAnsi="Calibri"/>
+                <w:b w:val="0"/>
+                <w:i/>
+                <w:sz w:val="19"/>
+              </w:rPr>
+              <w:t>Wären wir der Kunde — wir würden diese Zahlen nicht mehr zahlen. Genau deshalb ändern wir die Strategie.</w:t>
+            </w:r>
+          </w:p>
+        </w:tc>
+      </w:tr>
+    </w:tbl>
+    <w:p>
+      <w:pPr>
+        <w:spacing w:before="0" w:after="40"/>
+      </w:pPr>
+    </w:p>
+    <w:p>
+      <w:pPr>
+        <w:pBdr>
+          <w:top w:val="single" w:sz="6" w:space="1" w:color="CCDDEE"/>
+        </w:pBdr>
+        <w:spacing w:before="320" w:after="0"/>
+      </w:pPr>
+    </w:p>
+    <w:tbl>
+      <w:tblPr>
+        <w:tblStyle w:val="TableGrid"/>
+        <w:tblW w:type="auto" w:w="0"/>
+        <w:tblLook w:firstColumn="1" w:firstRow="1" w:lastColumn="0" w:lastRow="0" w:noHBand="0" w:noVBand="1" w:val="04A0"/>
+      </w:tblPr>
+      <w:tblGrid>
+        <w:gridCol w:w="794"/>
+        <w:gridCol w:w="2154"/>
+        <w:gridCol w:w="6973"/>
+      </w:tblGrid>
+      <w:tr>
+        <w:tc>
+          <w:tcPr>
+            <w:tcW w:type="dxa" w:w="3135"/>
+            <w:tcBorders>
+              <w:top w:val="none"/>
+              <w:left w:val="none"/>
+              <w:bottom w:val="none"/>
+              <w:right w:val="none"/>
+            </w:tcBorders>
+            <w:shd w:val="clear" w:color="auto" w:fill="033d62"/>
+          </w:tcPr>
+          <w:p>
+            <w:pPr>
+              <w:spacing w:before="120" w:after="120"/>
+              <w:jc w:val="center"/>
+            </w:pPr>
+            <w:r>
+              <w:rPr>
+                <w:rFonts w:ascii="Calibri" w:hAnsi="Calibri"/>
+                <w:b/>
+                <w:i w:val="0"/>
+                <w:color w:val="FFFFFF"/>
+                <w:sz w:val="30"/>
+              </w:rPr>
+              <w:t>3</w:t>
+            </w:r>
+          </w:p>
+        </w:tc>
+        <w:tc>
+          <w:tcPr>
+            <w:tcW w:type="dxa" w:w="3135"/>
+            <w:tcBorders>
+              <w:top w:val="none"/>
+              <w:left w:val="none"/>
+              <w:bottom w:val="none"/>
+              <w:right w:val="none"/>
+            </w:tcBorders>
+            <w:shd w:val="clear" w:color="auto" w:fill="EBF4FA"/>
+          </w:tcPr>
+          <w:p>
+            <w:pPr>
+              <w:spacing w:before="80" w:after="80"/>
+            </w:pPr>
+            <w:r>
+              <w:rPr>
+                <w:rFonts w:ascii="Calibri" w:hAnsi="Calibri"/>
+                <w:b/>
+                <w:i w:val="0"/>
+                <w:color w:val="055A8D"/>
+                <w:sz w:val="15"/>
+              </w:rPr>
+              <w:t>WARUM</w:t>
+            </w:r>
+          </w:p>
+          <w:p>
+            <w:pPr>
+              <w:spacing w:before="0" w:after="80"/>
+            </w:pPr>
+            <w:r>
+              <w:rPr>
+                <w:rFonts w:ascii="Calibri" w:hAnsi="Calibri"/>
+                <w:b w:val="0"/>
+                <w:i w:val="0"/>
+                <w:color w:val="666666"/>
+                <w:sz w:val="15"/>
+              </w:rPr>
+              <w:t>Folie</w:t>
+            </w:r>
+          </w:p>
+        </w:tc>
+        <w:tc>
+          <w:tcPr>
+            <w:tcW w:type="dxa" w:w="3135"/>
+            <w:tcBorders>
+              <w:top w:val="none"/>
+              <w:left w:val="none"/>
+              <w:bottom w:val="none"/>
+              <w:right w:val="none"/>
+            </w:tcBorders>
+            <w:shd w:val="clear" w:color="auto" w:fill="055a8d"/>
+          </w:tcPr>
+          <w:p>
+            <w:pPr>
+              <w:spacing w:before="140" w:after="140"/>
+            </w:pPr>
+            <w:r>
+              <w:rPr>
+                <w:rFonts w:ascii="Calibri" w:hAnsi="Calibri"/>
+                <w:b/>
+                <w:i w:val="0"/>
+                <w:color w:val="FFFFFF"/>
+                <w:sz w:val="28"/>
+              </w:rPr>
+              <w:t>Was läuft gut — und was bremst uns?</w:t>
             </w:r>
           </w:p>
         </w:tc>
@@ -612,7 +1488,7 @@
                 <w:i w:val="0"/>
                 <w:sz w:val="19"/>
               </w:rPr>
-              <w:t>Content mit Persönlichkeit funktioniert (ER 31–45%)</w:t>
+              <w:t>Content mit Persönlichkeit funktioniert (ER 31–45 %)</w:t>
             </w:r>
           </w:p>
           <w:p>
@@ -725,7 +1601,7 @@
                 <w:i w:val="0"/>
                 <w:sz w:val="19"/>
               </w:rPr>
-              <w:t>Wachstum stagniert: +7 Follower in 90 Tagen</w:t>
+              <w:t>Wachstum stagniert — +7 Follower in 90 Tagen</w:t>
             </w:r>
           </w:p>
           <w:p>
@@ -800,7 +1676,7 @@
                 <w:i w:val="0"/>
                 <w:sz w:val="19"/>
               </w:rPr>
-              <w:t>Kanäle laufen nebeneinander — kein System</w:t>
+              <w:t>Kanäle laufen nebeneinander statt als System</w:t>
             </w:r>
           </w:p>
           <w:p>
@@ -945,7 +1821,7 @@
                 <w:color w:val="FFFFFF"/>
                 <w:sz w:val="30"/>
               </w:rPr>
-              <w:t>3</w:t>
+              <w:t>4</w:t>
             </w:r>
           </w:p>
         </w:tc>
@@ -1164,7 +2040,7 @@
                 <w:b/>
                 <w:i w:val="0"/>
                 <w:color w:val="055A8D"/>
-                <w:sz w:val="28"/>
+                <w:sz w:val="19"/>
               </w:rPr>
             </w:r>
           </w:p>
@@ -1191,7 +2067,7 @@
                 <w:b/>
                 <w:i w:val="0"/>
                 <w:color w:val="055A8D"/>
-                <w:sz w:val="28"/>
+                <w:sz w:val="19"/>
               </w:rPr>
             </w:r>
           </w:p>
@@ -1366,7 +2242,7 @@
                 <w:b/>
                 <w:i w:val="0"/>
                 <w:color w:val="055A8D"/>
-                <w:sz w:val="28"/>
+                <w:sz w:val="19"/>
               </w:rPr>
             </w:r>
           </w:p>
@@ -1570,7 +2446,7 @@
                 <w:i/>
                 <w:sz w:val="19"/>
               </w:rPr>
-              <w:t>Hier beginnt der Kunde zu verstehen, dass wir nicht Kanäle verkaufen — sondern ein System.</w:t>
+              <w:t>Hier beginnt der Kunde zu verstehen: wir verkaufen keine Kanäle — sondern ein System.</w:t>
             </w:r>
           </w:p>
         </w:tc>
@@ -1625,7 +2501,7 @@
                 <w:color w:val="FFFFFF"/>
                 <w:sz w:val="30"/>
               </w:rPr>
-              <w:t>4</w:t>
+              <w:t>5</w:t>
             </w:r>
           </w:p>
         </w:tc>
@@ -2052,7 +2928,7 @@
                 <w:color w:val="FFFFFF"/>
                 <w:sz w:val="30"/>
               </w:rPr>
-              <w:t>5</w:t>
+              <w:t>6</w:t>
             </w:r>
           </w:p>
         </w:tc>
@@ -2154,8 +3030,8 @@
         <w:tblLook w:firstColumn="1" w:firstRow="1" w:lastColumn="0" w:lastRow="0" w:noHBand="0" w:noVBand="1" w:val="04A0"/>
       </w:tblPr>
       <w:tblGrid>
-        <w:gridCol w:w="4535"/>
-        <w:gridCol w:w="5102"/>
+        <w:gridCol w:w="4252"/>
+        <w:gridCol w:w="5386"/>
       </w:tblGrid>
       <w:tr>
         <w:tc>
@@ -2167,17 +3043,10 @@
               <w:bottom w:val="none"/>
               <w:right w:val="none"/>
             </w:tcBorders>
-            <w:shd w:val="clear" w:color="auto" w:fill="EBF4FA"/>
-            <w:shd w:val="clear" w:color="auto" w:fill="E8F4FB"/>
-            <w:shd w:val="clear" w:color="auto" w:fill="EDF5FF"/>
-            <w:shd w:val="clear" w:color="auto" w:fill="FFF8E6"/>
-            <w:shd w:val="clear" w:color="auto" w:fill="E8F4E8"/>
-            <w:shd w:val="clear" w:color="auto" w:fill="F0F6FB"/>
           </w:tcPr>
           <w:p>
             <w:pPr>
-              <w:spacing w:before="0" w:after="0"/>
-              <w:jc w:val="center"/>
+              <w:spacing w:after="0"/>
             </w:pPr>
             <w:r>
               <w:rPr>
@@ -2187,36 +3056,6 @@
                 <w:sz w:val="2"/>
               </w:rPr>
             </w:r>
-          </w:p>
-          <w:p>
-            <w:pPr>
-              <w:spacing w:before="80" w:after="0"/>
-              <w:jc w:val="center"/>
-            </w:pPr>
-          </w:p>
-          <w:p>
-            <w:pPr>
-              <w:spacing w:before="80" w:after="0"/>
-              <w:jc w:val="center"/>
-            </w:pPr>
-          </w:p>
-          <w:p>
-            <w:pPr>
-              <w:spacing w:before="80" w:after="0"/>
-              <w:jc w:val="center"/>
-            </w:pPr>
-          </w:p>
-          <w:p>
-            <w:pPr>
-              <w:spacing w:before="80" w:after="0"/>
-              <w:jc w:val="center"/>
-            </w:pPr>
-          </w:p>
-          <w:p>
-            <w:pPr>
-              <w:spacing w:before="80" w:after="0"/>
-              <w:jc w:val="center"/>
-            </w:pPr>
           </w:p>
           <w:p>
             <w:pPr>
@@ -2730,7 +3569,7 @@
                 <w:color w:val="FFFFFF"/>
                 <w:sz w:val="30"/>
               </w:rPr>
-              <w:t>6</w:t>
+              <w:t>7</w:t>
             </w:r>
           </w:p>
         </w:tc>
@@ -3895,7 +4734,7 @@
                 <w:color w:val="FFFFFF"/>
                 <w:sz w:val="30"/>
               </w:rPr>
-              <w:t>7</w:t>
+              <w:t>8</w:t>
             </w:r>
           </w:p>
         </w:tc>
@@ -4140,31 +4979,6 @@
                 <w:i w:val="0"/>
                 <w:sz w:val="19"/>
               </w:rPr>
-              <w:t>Follower wachsen kaum</w:t>
-            </w:r>
-          </w:p>
-          <w:p>
-            <w:pPr>
-              <w:spacing w:before="40" w:after="60"/>
-              <w:ind w:left="170"/>
-            </w:pPr>
-            <w:r>
-              <w:rPr>
-                <w:rFonts w:ascii="Calibri" w:hAnsi="Calibri"/>
-                <w:b/>
-                <w:i w:val="0"/>
-                <w:color w:val="055A8D"/>
-                <w:sz w:val="19"/>
-              </w:rPr>
-              <w:t xml:space="preserve">→  </w:t>
-            </w:r>
-            <w:r>
-              <w:rPr>
-                <w:rFonts w:ascii="Calibri" w:hAnsi="Calibri"/>
-                <w:b w:val="0"/>
-                <w:i w:val="0"/>
-                <w:sz w:val="19"/>
-              </w:rPr>
               <w:t>Kampagnen ohne Bindungskanal</w:t>
             </w:r>
           </w:p>
@@ -4328,32 +5142,7 @@
                 <w:i w:val="0"/>
                 <w:sz w:val="19"/>
               </w:rPr>
-              <w:t>Audience wächst gezielt und relevant</w:t>
-            </w:r>
-          </w:p>
-          <w:p>
-            <w:pPr>
-              <w:spacing w:before="40" w:after="60"/>
-              <w:ind w:left="170"/>
-            </w:pPr>
-            <w:r>
-              <w:rPr>
-                <w:rFonts w:ascii="Calibri" w:hAnsi="Calibri"/>
-                <w:b/>
-                <w:i w:val="0"/>
-                <w:color w:val="055A8D"/>
-                <w:sz w:val="19"/>
-              </w:rPr>
-              <w:t xml:space="preserve">→  </w:t>
-            </w:r>
-            <w:r>
-              <w:rPr>
-                <w:rFonts w:ascii="Calibri" w:hAnsi="Calibri"/>
-                <w:b w:val="0"/>
-                <w:i w:val="0"/>
-                <w:sz w:val="19"/>
-              </w:rPr>
-              <w:t>Kampagnen bauen Community auf</w:t>
+              <w:t>Kampagnen bauen eigene Community auf</w:t>
             </w:r>
           </w:p>
           <w:p>
@@ -4489,7 +5278,7 @@
                 <w:color w:val="FFFFFF"/>
                 <w:sz w:val="30"/>
               </w:rPr>
-              <w:t>8</w:t>
+              <w:t>9</w:t>
             </w:r>
           </w:p>
         </w:tc>
@@ -5195,7 +5984,7 @@
                 <w:color w:val="FFFFFF"/>
                 <w:sz w:val="30"/>
               </w:rPr>
-              <w:t>9</w:t>
+              <w:t>10</w:t>
             </w:r>
           </w:p>
         </w:tc>
@@ -5760,7 +6549,7 @@
                 <w:i w:val="0"/>
                 <w:sz w:val="19"/>
               </w:rPr>
-              <w:t>Print-Schiene ausgebaut (IMMOBILIEN Business)</w:t>
+              <w:t>Print-Schiene ausgebaut</w:t>
             </w:r>
           </w:p>
           <w:p>
@@ -5901,7 +6690,7 @@
                 <w:color w:val="FFFFFF"/>
                 <w:sz w:val="30"/>
               </w:rPr>
-              <w:t>10</w:t>
+              <w:t>11</w:t>
             </w:r>
           </w:p>
         </w:tc>
@@ -6054,7 +6843,7 @@
                 <w:color w:val="222222"/>
                 <w:sz w:val="18"/>
               </w:rPr>
-              <w:t>Treuhänder, Notare, Nachbarn denken beim Thema Immobilien an Belle Immo.</w:t>
+              <w:t>Treuhänder, Notare, Nachbarn — Belle Immo kommt automatisch.</w:t>
             </w:r>
           </w:p>
         </w:tc>
@@ -6302,7 +7091,7 @@
                 <w:color w:val="222222"/>
                 <w:sz w:val="18"/>
               </w:rPr>
-              <w:t>In 2 Jahren: Belle Immo ist die erste Adresse in der Region.</w:t>
+              <w:t>Belle Immo ist die erste Adresse in der Region.</w:t>
             </w:r>
           </w:p>
         </w:tc>
@@ -6413,7 +7202,7 @@
                 <w:color w:val="FFFFFF"/>
                 <w:sz w:val="30"/>
               </w:rPr>
-              <w:t>11</w:t>
+              <w:t>12</w:t>
             </w:r>
           </w:p>
         </w:tc>
@@ -6619,7 +7408,7 @@
           <w:color w:val="666666"/>
           <w:sz w:val="18"/>
         </w:rPr>
-        <w:t>Keine «Danke»-Folie. Die Fragen stehen im Raum. Aus einer Präsentation wird ein Strategiegespräch.</w:t>
+        <w:t>Keine «Danke»-Folie. Drei offene Fragen. Aus einer Präsentation wird ein Strategiegespräch.</w:t>
       </w:r>
     </w:p>
     <w:p>

</xml_diff>